<commit_message>
Per-code reliability as a 4x2 grid with full move names; add to report as Figure 5
Co-Authored-By: Claude Opus 5.5 <noreply@anthropic.com>
</commit_message>
<xml_diff>
--- a/results/SystemOne/Jev_Annotation_Report.docx
+++ b/results/SystemOne/Jev_Annotation_Report.docx
@@ -5162,9 +5162,9 @@
       <w:r>
         <w:drawing>
           <wp:inline distT="0" distB="0" distL="0" distR="0">
-            <wp:extent cx="5943600" cy="1924050"/>
+            <wp:extent cx="5943600" cy="3562350"/>
             <wp:effectExtent t="0" r="0" b="0" l="0"/>
-            <wp:docPr id="5" name="fig5" descr="Accuracy of the labels kept when only the most confident utterances are kept. Orange: Jev's own confidence. Grey: agreement among the six LLMs (share giving the modal label)." title="Figure 5"/>
+            <wp:docPr id="5" name="fig5" descr="Per-code reliability (one move vs. all others). For each code, Jev's probability for that code against the share of utterances humans gave that code, by prompt condition. Above the dashed line Jev under-predicts the code; below it, Jev over-predicts." title="Figure 5"/>
             <wp:cNvGraphicFramePr>
               <a:graphicFrameLocks xmlns:a="http://schemas.openxmlformats.org/drawingml/2006/main" noChangeAspect="1"/>
             </wp:cNvGraphicFramePr>
@@ -5187,6 +5187,170 @@
                   <pic:spPr bwMode="auto">
                     <a:xfrm>
                       <a:off x="0" y="0"/>
+                      <a:ext cx="5943600" cy="3562350"/>
+                    </a:xfrm>
+                    <a:prstGeom prst="rect">
+                      <a:avLst/>
+                    </a:prstGeom>
+                  </pic:spPr>
+                </pic:pic>
+              </a:graphicData>
+            </a:graphic>
+          </wp:inline>
+        </w:drawing>
+      </w:r>
+    </w:p>
+    <w:p>
+      <w:pPr>
+        <w:spacing w:after="240"/>
+      </w:pPr>
+      <w:r>
+        <w:rPr>
+          <w:rFonts w:ascii="Calibri" w:cs="Calibri" w:eastAsia="Calibri" w:hAnsi="Calibri"/>
+          <w:b/>
+          <w:bCs/>
+          <w:sz w:val="19"/>
+          <w:szCs w:val="19"/>
+        </w:rPr>
+        <w:t xml:space="preserve">Figure 5. </w:t>
+      </w:r>
+      <w:r>
+        <w:rPr>
+          <w:rFonts w:ascii="Calibri" w:cs="Calibri" w:eastAsia="Calibri" w:hAnsi="Calibri"/>
+          <w:color w:val="404040"/>
+          <w:sz w:val="19"/>
+          <w:szCs w:val="19"/>
+        </w:rPr>
+        <w:t xml:space="preserve">Per-code reliability (one move vs. all others). For each code, Jev's probability for that code against the share of utterances humans gave that code, by prompt condition. Above the dashed line Jev under-predicts the code; below it, Jev over-predicts.</w:t>
+      </w:r>
+    </w:p>
+    <w:p>
+      <w:pPr>
+        <w:spacing w:after="120" w:line="276"/>
+      </w:pPr>
+      <w:r>
+        <w:rPr>
+          <w:rFonts w:ascii="Calibri" w:cs="Calibri" w:eastAsia="Calibri" w:hAnsi="Calibri"/>
+        </w:rPr>
+        <w:t xml:space="preserve">Breaking calibration down by code (Figure 5) shows three different patterns:</w:t>
+      </w:r>
+    </w:p>
+    <w:p>
+      <w:pPr>
+        <w:pStyle w:val="ListParagraph"/>
+        <w:numPr>
+          <w:ilvl w:val="0"/>
+          <w:numId w:val="2"/>
+        </w:numPr>
+        <w:spacing w:after="80" w:line="276"/>
+      </w:pPr>
+      <w:r>
+        <w:rPr>
+          <w:rFonts w:ascii="Calibri" w:cs="Calibri" w:eastAsia="Calibri" w:hAnsi="Calibri"/>
+          <w:b/>
+          <w:bCs/>
+        </w:rPr>
+        <w:t xml:space="preserve">Close to calibrated: </w:t>
+      </w:r>
+      <w:r>
+        <w:rPr>
+          <w:rFonts w:ascii="Calibri" w:cs="Calibri" w:eastAsia="Calibri" w:hAnsi="Calibri"/>
+        </w:rPr>
+        <w:t xml:space="preserve">Pressing for Accuracy and Relating to Another's Ideas. Jev's probabilities can be read roughly at face value.</w:t>
+      </w:r>
+    </w:p>
+    <w:p>
+      <w:pPr>
+        <w:pStyle w:val="ListParagraph"/>
+        <w:numPr>
+          <w:ilvl w:val="0"/>
+          <w:numId w:val="2"/>
+        </w:numPr>
+        <w:spacing w:after="80" w:line="276"/>
+      </w:pPr>
+      <w:r>
+        <w:rPr>
+          <w:rFonts w:ascii="Calibri" w:cs="Calibri" w:eastAsia="Calibri" w:hAnsi="Calibri"/>
+          <w:b/>
+          <w:bCs/>
+        </w:rPr>
+        <w:t xml:space="preserve">Over-predicted until very high probability: </w:t>
+      </w:r>
+      <w:r>
+        <w:rPr>
+          <w:rFonts w:ascii="Calibri" w:cs="Calibri" w:eastAsia="Calibri" w:hAnsi="Calibri"/>
+        </w:rPr>
+        <w:t xml:space="preserve">Restating, Revoicing and Pressing for Reasoning. Below about 0.8, humans rarely gave the code, however much probability Jev assigned. Only Jev's top bin, near 1.0, means much, and even there Revoicing and Reasoning are right only 35–55% of the time. This matches the Restating/Revoicing confusions in Figure 3.</w:t>
+      </w:r>
+    </w:p>
+    <w:p>
+      <w:pPr>
+        <w:pStyle w:val="ListParagraph"/>
+        <w:numPr>
+          <w:ilvl w:val="0"/>
+          <w:numId w:val="2"/>
+        </w:numPr>
+        <w:spacing w:after="80" w:line="276"/>
+      </w:pPr>
+      <w:r>
+        <w:rPr>
+          <w:rFonts w:ascii="Calibri" w:cs="Calibri" w:eastAsia="Calibri" w:hAnsi="Calibri"/>
+          <w:b/>
+          <w:bCs/>
+        </w:rPr>
+        <w:t xml:space="preserve">Under-predicted: </w:t>
+      </w:r>
+      <w:r>
+        <w:rPr>
+          <w:rFonts w:ascii="Calibri" w:cs="Calibri" w:eastAsia="Calibri" w:hAnsi="Calibri"/>
+        </w:rPr>
+        <w:t xml:space="preserve">None. Whatever probability Jev gives None, humans chose None more often, which is the main source of the overall overconfidence. Keeping Everyone Together is nearly flat, so its probability carries little information except in FewShot_ALL.</w:t>
+      </w:r>
+    </w:p>
+    <w:p>
+      <w:pPr>
+        <w:spacing w:after="120" w:line="276"/>
+      </w:pPr>
+      <w:r>
+        <w:rPr>
+          <w:rFonts w:ascii="Calibri" w:cs="Calibri" w:eastAsia="Calibri" w:hAnsi="Calibri"/>
+        </w:rPr>
+        <w:t xml:space="preserve">Because each code fails in its own direction, a single global temperature will not fix these errors; per-class recalibration is needed.</w:t>
+      </w:r>
+    </w:p>
+    <w:p>
+      <w:pPr>
+        <w:spacing w:after="60" w:before="120"/>
+        <w:jc w:val="center"/>
+      </w:pPr>
+      <w:r>
+        <w:drawing>
+          <wp:inline distT="0" distB="0" distL="0" distR="0">
+            <wp:extent cx="5943600" cy="1924050"/>
+            <wp:effectExtent t="0" r="0" b="0" l="0"/>
+            <wp:docPr id="6" name="fig6" descr="Accuracy of the labels kept when only the most confident utterances are kept. Orange: Jev's own confidence. Grey: agreement among the six LLMs (share giving the modal label)." title="Figure 6"/>
+            <wp:cNvGraphicFramePr>
+              <a:graphicFrameLocks xmlns:a="http://schemas.openxmlformats.org/drawingml/2006/main" noChangeAspect="1"/>
+            </wp:cNvGraphicFramePr>
+            <a:graphic xmlns:a="http://schemas.openxmlformats.org/drawingml/2006/main">
+              <a:graphicData uri="http://schemas.openxmlformats.org/drawingml/2006/picture">
+                <pic:pic xmlns:pic="http://schemas.openxmlformats.org/drawingml/2006/picture">
+                  <pic:nvPicPr>
+                    <pic:cNvPr id="0" name="" descr=""/>
+                    <pic:cNvPicPr>
+                      <a:picLocks noChangeAspect="1" noChangeArrowheads="1"/>
+                    </pic:cNvPicPr>
+                  </pic:nvPicPr>
+                  <pic:blipFill>
+                    <a:blip r:embed="rId13" cstate="none"/>
+                    <a:srcRect/>
+                    <a:stretch>
+                      <a:fillRect/>
+                    </a:stretch>
+                  </pic:blipFill>
+                  <pic:spPr bwMode="auto">
+                    <a:xfrm>
+                      <a:off x="0" y="0"/>
                       <a:ext cx="5943600" cy="1924050"/>
                     </a:xfrm>
                     <a:prstGeom prst="rect">
@@ -5212,7 +5376,7 @@
           <w:sz w:val="19"/>
           <w:szCs w:val="19"/>
         </w:rPr>
-        <w:t xml:space="preserve">Figure 5. </w:t>
+        <w:t xml:space="preserve">Figure 6. </w:t>
       </w:r>
       <w:r>
         <w:rPr>
@@ -5240,7 +5404,7 @@
         <w:rPr>
           <w:rFonts w:ascii="Calibri" w:cs="Calibri" w:eastAsia="Calibri" w:hAnsi="Calibri"/>
         </w:rPr>
-        <w:t xml:space="preserve">Figure 5 compares Jev's confidence with the strongest confidence signal available from the LLMs, which is how many of the six agree.</w:t>
+        <w:t xml:space="preserve">Figure 6 compares Jev's confidence with the strongest confidence signal available from the LLMs, which is how many of the six agree.</w:t>
       </w:r>
     </w:p>
     <w:p>
@@ -6127,7 +6291,7 @@
         <w:rPr>
           <w:rFonts w:ascii="Calibri" w:cs="Calibri" w:eastAsia="Calibri" w:hAnsi="Calibri"/>
         </w:rPr>
-        <w:t xml:space="preserve">Recalibrate Jev's probabilities (temperature and per-class) within transcript folds and re-measure calibration.</w:t>
+        <w:t xml:space="preserve">Recalibrate Jev's probabilities within transcript folds and re-measure calibration. Figure 5 suggests per-class recalibration (for example, a per-code bias on None and the comparison codes) will do much better than one global temperature.</w:t>
       </w:r>
     </w:p>
     <w:p>

</xml_diff>